<commit_message>
docs: rewrite the abstract as a third-person academic abstract
</commit_message>
<xml_diff>
--- a/docs/abstract.docx
+++ b/docs/abstract.docx
@@ -38,51 +38,12 @@
           <w:b w:val="0"/>
           <w:sz w:val="24"/>
         </w:rPr>
-        <w:t>An internal short inside one cell is often named as the cause of lithium-ion battery accidents. In its most common form it starts small: it slowly drains its own cell and makes only a fraction of a watt of heat. A normal battery management system (BMS) cannot see this stage, because it acts only when a voltage, current or temperature crosses a fixed limit. In this project I am building a four-cell (4S1P) NCR18650GA battery pack with two layers of protection: an independent hardware BMS, and an ESP32 supervisor that predicts. Five times a second, the ESP32 runs a physical thermal model of every cell with a Kalman filter, and estimates what no sensor can measure: the core temperature, and the abnormal heat, in watts, that the cell's own current cannot explain. It forecasts each cell's temperature 1 and 5 minutes ahead and checks every forecast against the real reading, and at rest it estimates each cell's self-discharge from its voltage. All of this evidence becomes one risk level (Normal, Watch, Warning or Trip), which can open separate charge and load relays and keep them latched.</w:t>
+        <w:t>Thermal runaway is a major safety hazard in lithium-ion battery packs, and one of its main causes is an internal short circuit, which in its early stage slowly discharges the affected cell and generates only a fraction of a watt of heat. Conventional battery management systems (BMS) and battery protection ICs act only when a voltage, current or temperature crosses a fixed threshold, and therefore cannot detect this stage. This project presents a predictive thermal battery management system for a 4S1P lithium-ion pack of NCR18650GA cells. The system has two independent protection layers: a hardware BMS that provides over-voltage, under-voltage, over-current and short-circuit protection, and an ESP32-based supervisory controller that samples the four cell voltages through a 16-bit ADS1115 ADC, the pack current through an INA226 with a 5 mΩ shunt, and the four cell temperatures and the ambient temperature through NTC thermistors at 5 Hz. A two-state (core and surface) lumped thermal model of each cell is combined with a Kalman filter to estimate the core temperature and the abnormal heat generation, in watts, that the cell's I²R losses cannot explain. The model predicts each cell's temperature 1 and 5 minutes ahead and confirms every prediction against the measured value. Additional algorithms track the internal resistance online, estimate the self-discharge current of each cell at rest from its relative voltage drift, cross-check the thermal and electrical evidence through an energy balance, forecast the time to the temperature limit and the safe continuous current, and detect self-accelerating heating. These indicators are combined into a four-level risk classification (Normal, Watch, Warning and Trip) that controls separate charge and load relays with latched, fail-safe tripping, and a Wi-Fi dashboard displays the estimates. Compared with the LSTM neural-network method of the base paper, which requires offline GPU training and responds only to rapid temperature rises of about 9 °C/min, the proposed model-based method needs no training data, runs on a low-cost microcontroller and is designed to detect abnormal heat of about 0.4 W (0.5 °C/min), a temperature rise about eighteen times slower. The system is evaluated through sensor calibration, controlled charge and discharge tests, and a safely emulated soft internal short circuit created with an external resistor.</w:t>
       </w:r>
     </w:p>
     <w:p>
       <w:pPr>
-        <w:spacing w:before="0" w:after="120" w:line="259" w:lineRule="auto"/>
-        <w:jc w:val="both"/>
-      </w:pPr>
-      <w:r>
-        <w:rPr>
-          <w:b w:val="0"/>
-          <w:sz w:val="24"/>
-        </w:rPr>
-        <w:t>I benchmarked the design against six commercial products, from a ₹239 hardware BMS board and protection chips from TI, ADI and NXP to the Orion BMS and the Li-ion Tamer gas sensor. All of them handle temperature with fixed limits, and the only early warning among them, the gas sensor (US$596), reacts only after a cell has vented. Among seven published methods, the longest warnings come from methods trained on cells or a vehicle taken into thermal runaway, and only one of them acts on the battery.</w:t>
-      </w:r>
-    </w:p>
-    <w:p>
-      <w:pPr>
-        <w:spacing w:before="0" w:after="120" w:line="259" w:lineRule="auto"/>
-        <w:jc w:val="both"/>
-      </w:pPr>
-      <w:r>
-        <w:rPr>
-          <w:b w:val="0"/>
-          <w:sz w:val="24"/>
-        </w:rPr>
-        <w:t>The Delta X over the base paper, Ojo et al. (IEEE TIE, 2021), which flags faults with a trained neural network, is as follows. My design needs no training data: 11 physical constants, fitted once from normal use, replace about 21,000 trained weights. The base paper's 0.69 °C threshold within its 4.5 s window catches heating only above about 9 °C/min, while my design is built to warn at 0.5 °C/min (about 0.4 W), 18 times slower, and its 5-minute check catches 0.2 W. It adds electrical evidence of a short, a leak from 20 mA; it needs 10–30 s of persistence and agreement between thermal and electrical evidence before an alarm; it uses about 2,000 times less arithmetic per estimate on a ₹639 ESP32 instead of a Jetson TX2 or Raspberry Pi; and it disconnects the pack instead of only raising a flag.</w:t>
-      </w:r>
-    </w:p>
-    <w:p>
-      <w:pPr>
-        <w:spacing w:before="0" w:after="120" w:line="259" w:lineRule="auto"/>
-        <w:jc w:val="both"/>
-      </w:pPr>
-      <w:r>
-        <w:rPr>
-          <w:b w:val="0"/>
-          <w:sz w:val="24"/>
-        </w:rPr>
-        <w:t>Semester 1 builds and calibrates the electronics and the first predictive firmware with no lithium cells (Gates 0–2). Semester 2 builds the pack and tests every target at Gates 9–11, including a safely emulated soft short. Until those tests, all figures for my design are targets, not results.</w:t>
-      </w:r>
-    </w:p>
-    <w:p>
-      <w:pPr>
-        <w:spacing w:before="360" w:after="0" w:line="398" w:lineRule="auto"/>
+        <w:spacing w:before="960" w:after="0" w:line="398" w:lineRule="auto"/>
         <w:ind w:left="4344"/>
       </w:pPr>
       <w:r>
@@ -95,7 +56,7 @@
     </w:p>
     <w:p>
       <w:pPr>
-        <w:spacing w:before="420" w:after="0" w:line="379" w:lineRule="auto"/>
+        <w:spacing w:before="1000" w:after="0" w:line="379" w:lineRule="auto"/>
         <w:ind w:left="5600"/>
         <w:jc w:val="center"/>
       </w:pPr>

</xml_diff>